<commit_message>
feat(jinoyat): split jarima/muddat into 4 standalone templates
Per request, replace the 2 smart (org/individual-branching) templates
with 4 plain ones — no runtime plaintiff_type choice:

- shikoyat-jinoyat-jarima        — reduce fine (individual)
- shikoyat-jinoyat-jarima-org    — reduce fine (organisation)
- iltimosnoma-jinoyat-muddat     — restore complaint deadline (individual)
- iltimosnoma-jinoyat-muddat-org — restore complaint deadline (organisation)

Each hard-codes its «from» header and signature, so the docxtemplater
conditional blocks and the applicant_is_org flags in document.service
are removed. Generated all 12 locale .docx files; verified each renders
the right variant with no leftover tags.

Co-Authored-By: Claude Opus 4.8 (1M context) <noreply@anthropic.com>
</commit_message>
<xml_diff>
--- a/templates/iltimosnoma-jinoyat-muddat.ru.docx
+++ b/templates/iltimosnoma-jinoyat-muddat.ru.docx
@@ -56,20 +56,6 @@
     </w:p>
     <w:p>
       <w:pPr>
-        <w:spacing w:after="80"/>
-        <w:jc w:val="left"/>
-      </w:pPr>
-      <w:r>
-        <w:rPr>
-          <w:rFonts w:ascii="Times New Roman" w:cs="Times New Roman" w:eastAsia="Times New Roman" w:hAnsi="Times New Roman"/>
-          <w:sz w:val="24"/>
-          <w:szCs w:val="24"/>
-        </w:rPr>
-        <w:t xml:space="preserve">{{#applicant_is_individual}}</w:t>
-      </w:r>
-    </w:p>
-    <w:p>
-      <w:pPr>
         <w:spacing w:after="0"/>
         <w:ind w:left="5400"/>
         <w:jc w:val="left"/>
@@ -132,71 +118,39 @@
           <w:sz w:val="24"/>
           <w:szCs w:val="24"/>
         </w:rPr>
-        <w:t xml:space="preserve">{{/applicant_is_individual}}</w:t>
-      </w:r>
-    </w:p>
-    <w:p>
-      <w:pPr>
-        <w:spacing w:after="80"/>
-        <w:jc w:val="left"/>
-      </w:pPr>
-      <w:r>
-        <w:rPr>
-          <w:rFonts w:ascii="Times New Roman" w:cs="Times New Roman" w:eastAsia="Times New Roman" w:hAnsi="Times New Roman"/>
-          <w:sz w:val="24"/>
-          <w:szCs w:val="24"/>
-        </w:rPr>
-        <w:t xml:space="preserve">{{#applicant_is_org}}</w:t>
-      </w:r>
-    </w:p>
-    <w:p>
-      <w:pPr>
-        <w:spacing w:after="0"/>
-        <w:ind w:left="5400"/>
-        <w:jc w:val="left"/>
-      </w:pPr>
-      <w:r>
-        <w:rPr>
-          <w:rFonts w:ascii="Times New Roman" w:cs="Times New Roman" w:eastAsia="Times New Roman" w:hAnsi="Times New Roman"/>
-          <w:i/>
-          <w:iCs/>
-          <w:sz w:val="24"/>
-          <w:szCs w:val="24"/>
-        </w:rPr>
-        <w:t xml:space="preserve">{{plaintiff_org_name}}</w:t>
-      </w:r>
-    </w:p>
-    <w:p>
-      <w:pPr>
-        <w:spacing w:after="0"/>
-        <w:ind w:left="5400"/>
-        <w:jc w:val="left"/>
+        <w:t xml:space="preserve"/>
+      </w:r>
+    </w:p>
+    <w:p>
+      <w:pPr>
+        <w:spacing w:after="0"/>
+        <w:jc w:val="center"/>
       </w:pPr>
       <w:r>
         <w:rPr>
           <w:rFonts w:ascii="Times New Roman" w:cs="Times New Roman" w:eastAsia="Times New Roman" w:hAnsi="Times New Roman"/>
           <w:b/>
           <w:bCs/>
-          <w:i/>
-          <w:iCs/>
-          <w:sz w:val="24"/>
-          <w:szCs w:val="24"/>
-        </w:rPr>
-        <w:t xml:space="preserve">в лице руководителя {{plaintiff_fio}}</w:t>
-      </w:r>
-    </w:p>
-    <w:p>
-      <w:pPr>
-        <w:spacing w:after="80"/>
-        <w:jc w:val="left"/>
-      </w:pPr>
-      <w:r>
-        <w:rPr>
-          <w:rFonts w:ascii="Times New Roman" w:cs="Times New Roman" w:eastAsia="Times New Roman" w:hAnsi="Times New Roman"/>
-          <w:sz w:val="24"/>
-          <w:szCs w:val="24"/>
-        </w:rPr>
-        <w:t xml:space="preserve">{{/applicant_is_org}}</w:t>
+          <w:sz w:val="24"/>
+          <w:szCs w:val="24"/>
+        </w:rPr>
+        <w:t xml:space="preserve">Х О Д А Т А Й С Т В О</w:t>
+      </w:r>
+    </w:p>
+    <w:p>
+      <w:pPr>
+        <w:spacing w:after="80"/>
+        <w:jc w:val="center"/>
+      </w:pPr>
+      <w:r>
+        <w:rPr>
+          <w:rFonts w:ascii="Times New Roman" w:cs="Times New Roman" w:eastAsia="Times New Roman" w:hAnsi="Times New Roman"/>
+          <w:i/>
+          <w:iCs/>
+          <w:sz w:val="24"/>
+          <w:szCs w:val="24"/>
+        </w:rPr>
+        <w:t xml:space="preserve">(о восстановлении срока подачи жалобы)</w:t>
       </w:r>
     </w:p>
     <w:p>
@@ -216,7 +170,81 @@
     <w:p>
       <w:pPr>
         <w:spacing w:after="0"/>
-        <w:jc w:val="center"/>
+        <w:ind w:firstLine="720"/>
+        <w:jc w:val="both"/>
+      </w:pPr>
+      <w:r>
+        <w:rPr>
+          <w:rFonts w:ascii="Times New Roman" w:cs="Times New Roman" w:eastAsia="Times New Roman" w:hAnsi="Times New Roman"/>
+          <w:sz w:val="24"/>
+          <w:szCs w:val="24"/>
+        </w:rPr>
+        <w:t xml:space="preserve">Настоящим сообщаю, что {{penalty_org}} {{order_day}}.{{order_month}}.{{order_year}} в отношении меня вынесено постановление о наложении административного штрафа в размере {{fine_amount}} сум.</w:t>
+      </w:r>
+    </w:p>
+    <w:p>
+      <w:pPr>
+        <w:spacing w:after="0"/>
+        <w:ind w:firstLine="720"/>
+        <w:jc w:val="both"/>
+      </w:pPr>
+      <w:r>
+        <w:rPr>
+          <w:rFonts w:ascii="Times New Roman" w:cs="Times New Roman" w:eastAsia="Times New Roman" w:hAnsi="Times New Roman"/>
+          <w:sz w:val="24"/>
+          <w:szCs w:val="24"/>
+        </w:rPr>
+        <w:t xml:space="preserve">Данное постановление я не получил(а) вовремя по причине: {{late_reason}}</w:t>
+      </w:r>
+    </w:p>
+    <w:p>
+      <w:pPr>
+        <w:spacing w:after="0"/>
+        <w:ind w:firstLine="720"/>
+        <w:jc w:val="both"/>
+      </w:pPr>
+      <w:r>
+        <w:rPr>
+          <w:rFonts w:ascii="Times New Roman" w:cs="Times New Roman" w:eastAsia="Times New Roman" w:hAnsi="Times New Roman"/>
+          <w:sz w:val="24"/>
+          <w:szCs w:val="24"/>
+        </w:rPr>
+        <w:t xml:space="preserve">Указанное постановление я получил(а) {{learned_day}}.{{learned_month}}.{{learned_year}} через {{learned_where}}, в связи с чем срок подачи жалобы на постановление был пропущен.</w:t>
+      </w:r>
+    </w:p>
+    <w:p>
+      <w:pPr>
+        <w:spacing w:after="0"/>
+        <w:ind w:firstLine="720"/>
+        <w:jc w:val="both"/>
+      </w:pPr>
+      <w:r>
+        <w:rPr>
+          <w:rFonts w:ascii="Times New Roman" w:cs="Times New Roman" w:eastAsia="Times New Roman" w:hAnsi="Times New Roman"/>
+          <w:sz w:val="24"/>
+          <w:szCs w:val="24"/>
+        </w:rPr>
+        <w:t xml:space="preserve">На основании изложенного прошу восстановить срок подачи жалобы по данному постановлению.</w:t>
+      </w:r>
+    </w:p>
+    <w:p>
+      <w:pPr>
+        <w:spacing w:after="80"/>
+        <w:jc w:val="left"/>
+      </w:pPr>
+      <w:r>
+        <w:rPr>
+          <w:rFonts w:ascii="Times New Roman" w:cs="Times New Roman" w:eastAsia="Times New Roman" w:hAnsi="Times New Roman"/>
+          <w:sz w:val="24"/>
+          <w:szCs w:val="24"/>
+        </w:rPr>
+        <w:t xml:space="preserve"/>
+      </w:r>
+    </w:p>
+    <w:p>
+      <w:pPr>
+        <w:spacing w:after="80"/>
+        <w:jc w:val="left"/>
       </w:pPr>
       <w:r>
         <w:rPr>
@@ -226,23 +254,55 @@
           <w:sz w:val="24"/>
           <w:szCs w:val="24"/>
         </w:rPr>
-        <w:t xml:space="preserve">Х О Д А Т А Й С Т В О</w:t>
-      </w:r>
-    </w:p>
-    <w:p>
-      <w:pPr>
-        <w:spacing w:after="80"/>
-        <w:jc w:val="center"/>
-      </w:pPr>
-      <w:r>
-        <w:rPr>
-          <w:rFonts w:ascii="Times New Roman" w:cs="Times New Roman" w:eastAsia="Times New Roman" w:hAnsi="Times New Roman"/>
-          <w:i/>
-          <w:iCs/>
-          <w:sz w:val="24"/>
-          <w:szCs w:val="24"/>
-        </w:rPr>
-        <w:t xml:space="preserve">(о восстановлении срока подачи жалобы)</w:t>
+        <w:t xml:space="preserve">Приложение:</w:t>
+      </w:r>
+    </w:p>
+    <w:p>
+      <w:pPr>
+        <w:spacing w:after="0"/>
+        <w:jc w:val="left"/>
+      </w:pPr>
+      <w:r>
+        <w:rPr>
+          <w:rFonts w:ascii="Times New Roman" w:cs="Times New Roman" w:eastAsia="Times New Roman" w:hAnsi="Times New Roman"/>
+          <w:i/>
+          <w:iCs/>
+          <w:sz w:val="24"/>
+          <w:szCs w:val="24"/>
+        </w:rPr>
+        <w:t xml:space="preserve">- Копия паспорта;</w:t>
+      </w:r>
+    </w:p>
+    <w:p>
+      <w:pPr>
+        <w:spacing w:after="0"/>
+        <w:jc w:val="left"/>
+      </w:pPr>
+      <w:r>
+        <w:rPr>
+          <w:rFonts w:ascii="Times New Roman" w:cs="Times New Roman" w:eastAsia="Times New Roman" w:hAnsi="Times New Roman"/>
+          <w:i/>
+          <w:iCs/>
+          <w:sz w:val="24"/>
+          <w:szCs w:val="24"/>
+        </w:rPr>
+        <w:t xml:space="preserve">- Постановление о наложении штрафа;</w:t>
+      </w:r>
+    </w:p>
+    <w:p>
+      <w:pPr>
+        <w:spacing w:after="0"/>
+        <w:jc w:val="left"/>
+      </w:pPr>
+      <w:r>
+        <w:rPr>
+          <w:rFonts w:ascii="Times New Roman" w:cs="Times New Roman" w:eastAsia="Times New Roman" w:hAnsi="Times New Roman"/>
+          <w:i/>
+          <w:iCs/>
+          <w:sz w:val="24"/>
+          <w:szCs w:val="24"/>
+        </w:rPr>
+        <w:t xml:space="preserve">- Справка о причине пропуска срока подачи жалобы.</w:t>
       </w:r>
     </w:p>
     <w:p>
@@ -257,66 +317,6 @@
           <w:szCs w:val="24"/>
         </w:rPr>
         <w:t xml:space="preserve"/>
-      </w:r>
-    </w:p>
-    <w:p>
-      <w:pPr>
-        <w:spacing w:after="0"/>
-        <w:ind w:firstLine="720"/>
-        <w:jc w:val="both"/>
-      </w:pPr>
-      <w:r>
-        <w:rPr>
-          <w:rFonts w:ascii="Times New Roman" w:cs="Times New Roman" w:eastAsia="Times New Roman" w:hAnsi="Times New Roman"/>
-          <w:sz w:val="24"/>
-          <w:szCs w:val="24"/>
-        </w:rPr>
-        <w:t xml:space="preserve">Настоящим сообщаю, что {{penalty_org}} {{order_day}}.{{order_month}}.{{order_year}} в отношении меня вынесено постановление о наложении административного штрафа в размере {{fine_amount}} сум.</w:t>
-      </w:r>
-    </w:p>
-    <w:p>
-      <w:pPr>
-        <w:spacing w:after="0"/>
-        <w:ind w:firstLine="720"/>
-        <w:jc w:val="both"/>
-      </w:pPr>
-      <w:r>
-        <w:rPr>
-          <w:rFonts w:ascii="Times New Roman" w:cs="Times New Roman" w:eastAsia="Times New Roman" w:hAnsi="Times New Roman"/>
-          <w:sz w:val="24"/>
-          <w:szCs w:val="24"/>
-        </w:rPr>
-        <w:t xml:space="preserve">Данное постановление я не получил(а) вовремя по причине: {{late_reason}}</w:t>
-      </w:r>
-    </w:p>
-    <w:p>
-      <w:pPr>
-        <w:spacing w:after="0"/>
-        <w:ind w:firstLine="720"/>
-        <w:jc w:val="both"/>
-      </w:pPr>
-      <w:r>
-        <w:rPr>
-          <w:rFonts w:ascii="Times New Roman" w:cs="Times New Roman" w:eastAsia="Times New Roman" w:hAnsi="Times New Roman"/>
-          <w:sz w:val="24"/>
-          <w:szCs w:val="24"/>
-        </w:rPr>
-        <w:t xml:space="preserve">Указанное постановление я получил(а) {{learned_day}}.{{learned_month}}.{{learned_year}} через {{learned_where}}, в связи с чем срок подачи жалобы на постановление был пропущен.</w:t>
-      </w:r>
-    </w:p>
-    <w:p>
-      <w:pPr>
-        <w:spacing w:after="0"/>
-        <w:ind w:firstLine="720"/>
-        <w:jc w:val="both"/>
-      </w:pPr>
-      <w:r>
-        <w:rPr>
-          <w:rFonts w:ascii="Times New Roman" w:cs="Times New Roman" w:eastAsia="Times New Roman" w:hAnsi="Times New Roman"/>
-          <w:sz w:val="24"/>
-          <w:szCs w:val="24"/>
-        </w:rPr>
-        <w:t xml:space="preserve">На основании изложенного прошу восстановить срок подачи жалобы по данному постановлению.</w:t>
       </w:r>
     </w:p>
     <w:p>
@@ -346,104 +346,16 @@
           <w:sz w:val="24"/>
           <w:szCs w:val="24"/>
         </w:rPr>
-        <w:t xml:space="preserve">Приложение:</w:t>
-      </w:r>
-    </w:p>
-    <w:p>
-      <w:pPr>
-        <w:spacing w:after="0"/>
-        <w:jc w:val="left"/>
-      </w:pPr>
-      <w:r>
-        <w:rPr>
-          <w:rFonts w:ascii="Times New Roman" w:cs="Times New Roman" w:eastAsia="Times New Roman" w:hAnsi="Times New Roman"/>
-          <w:i/>
-          <w:iCs/>
-          <w:sz w:val="24"/>
-          <w:szCs w:val="24"/>
-        </w:rPr>
-        <w:t xml:space="preserve">- Копия паспорта;</w:t>
-      </w:r>
-    </w:p>
-    <w:p>
-      <w:pPr>
-        <w:spacing w:after="0"/>
-        <w:jc w:val="left"/>
-      </w:pPr>
-      <w:r>
-        <w:rPr>
-          <w:rFonts w:ascii="Times New Roman" w:cs="Times New Roman" w:eastAsia="Times New Roman" w:hAnsi="Times New Roman"/>
-          <w:i/>
-          <w:iCs/>
-          <w:sz w:val="24"/>
-          <w:szCs w:val="24"/>
-        </w:rPr>
-        <w:t xml:space="preserve">- Постановление о наложении штрафа;</w:t>
-      </w:r>
-    </w:p>
-    <w:p>
-      <w:pPr>
-        <w:spacing w:after="0"/>
-        <w:jc w:val="left"/>
-      </w:pPr>
-      <w:r>
-        <w:rPr>
-          <w:rFonts w:ascii="Times New Roman" w:cs="Times New Roman" w:eastAsia="Times New Roman" w:hAnsi="Times New Roman"/>
-          <w:i/>
-          <w:iCs/>
-          <w:sz w:val="24"/>
-          <w:szCs w:val="24"/>
-        </w:rPr>
-        <w:t xml:space="preserve">- Справка о причине пропуска срока подачи жалобы.</w:t>
-      </w:r>
-    </w:p>
-    <w:p>
-      <w:pPr>
-        <w:spacing w:after="80"/>
-        <w:jc w:val="left"/>
-      </w:pPr>
-      <w:r>
-        <w:rPr>
-          <w:rFonts w:ascii="Times New Roman" w:cs="Times New Roman" w:eastAsia="Times New Roman" w:hAnsi="Times New Roman"/>
-          <w:sz w:val="24"/>
-          <w:szCs w:val="24"/>
-        </w:rPr>
-        <w:t xml:space="preserve">{{#applicant_is_individual}}</w:t>
-      </w:r>
-    </w:p>
-    <w:p>
-      <w:pPr>
-        <w:spacing w:after="80"/>
-        <w:jc w:val="left"/>
-      </w:pPr>
-      <w:r>
-        <w:rPr>
-          <w:rFonts w:ascii="Times New Roman" w:cs="Times New Roman" w:eastAsia="Times New Roman" w:hAnsi="Times New Roman"/>
-          <w:sz w:val="24"/>
-          <w:szCs w:val="24"/>
-        </w:rPr>
-        <w:t xml:space="preserve"/>
-      </w:r>
-    </w:p>
-    <w:p>
-      <w:pPr>
-        <w:spacing w:after="80"/>
-        <w:jc w:val="left"/>
-      </w:pPr>
-      <w:r>
-        <w:rPr>
-          <w:rFonts w:ascii="Times New Roman" w:cs="Times New Roman" w:eastAsia="Times New Roman" w:hAnsi="Times New Roman"/>
-          <w:sz w:val="24"/>
-          <w:szCs w:val="24"/>
-        </w:rPr>
-        <w:t xml:space="preserve"/>
-      </w:r>
-    </w:p>
-    <w:p>
-      <w:pPr>
-        <w:spacing w:after="80"/>
-        <w:jc w:val="left"/>
-      </w:pPr>
+        <w:t xml:space="preserve">Заявитель:</w:t>
+      </w:r>
+      <w:r>
+        <w:rPr>
+          <w:rFonts w:ascii="Times New Roman" w:cs="Times New Roman" w:eastAsia="Times New Roman" w:hAnsi="Times New Roman"/>
+          <w:sz w:val="24"/>
+          <w:szCs w:val="24"/>
+        </w:rPr>
+        <w:t xml:space="preserve">                 (подпись)        </w:t>
+      </w:r>
       <w:r>
         <w:rPr>
           <w:rFonts w:ascii="Times New Roman" w:cs="Times New Roman" w:eastAsia="Times New Roman" w:hAnsi="Times New Roman"/>
@@ -452,129 +364,7 @@
           <w:sz w:val="24"/>
           <w:szCs w:val="24"/>
         </w:rPr>
-        <w:t xml:space="preserve">Заявитель:</w:t>
-      </w:r>
-      <w:r>
-        <w:rPr>
-          <w:rFonts w:ascii="Times New Roman" w:cs="Times New Roman" w:eastAsia="Times New Roman" w:hAnsi="Times New Roman"/>
-          <w:sz w:val="24"/>
-          <w:szCs w:val="24"/>
-        </w:rPr>
-        <w:t xml:space="preserve">                 (подпись)        </w:t>
-      </w:r>
-      <w:r>
-        <w:rPr>
-          <w:rFonts w:ascii="Times New Roman" w:cs="Times New Roman" w:eastAsia="Times New Roman" w:hAnsi="Times New Roman"/>
-          <w:b/>
-          <w:bCs/>
-          <w:sz w:val="24"/>
-          <w:szCs w:val="24"/>
-        </w:rPr>
         <w:t xml:space="preserve">{{plaintiff_fio}}</w:t>
-      </w:r>
-    </w:p>
-    <w:p>
-      <w:pPr>
-        <w:spacing w:after="80"/>
-        <w:jc w:val="left"/>
-      </w:pPr>
-      <w:r>
-        <w:rPr>
-          <w:rFonts w:ascii="Times New Roman" w:cs="Times New Roman" w:eastAsia="Times New Roman" w:hAnsi="Times New Roman"/>
-          <w:sz w:val="24"/>
-          <w:szCs w:val="24"/>
-        </w:rPr>
-        <w:t xml:space="preserve">{{/applicant_is_individual}}</w:t>
-      </w:r>
-    </w:p>
-    <w:p>
-      <w:pPr>
-        <w:spacing w:after="80"/>
-        <w:jc w:val="left"/>
-      </w:pPr>
-      <w:r>
-        <w:rPr>
-          <w:rFonts w:ascii="Times New Roman" w:cs="Times New Roman" w:eastAsia="Times New Roman" w:hAnsi="Times New Roman"/>
-          <w:sz w:val="24"/>
-          <w:szCs w:val="24"/>
-        </w:rPr>
-        <w:t xml:space="preserve">{{#applicant_is_org}}</w:t>
-      </w:r>
-    </w:p>
-    <w:p>
-      <w:pPr>
-        <w:spacing w:after="80"/>
-        <w:jc w:val="left"/>
-      </w:pPr>
-      <w:r>
-        <w:rPr>
-          <w:rFonts w:ascii="Times New Roman" w:cs="Times New Roman" w:eastAsia="Times New Roman" w:hAnsi="Times New Roman"/>
-          <w:sz w:val="24"/>
-          <w:szCs w:val="24"/>
-        </w:rPr>
-        <w:t xml:space="preserve"/>
-      </w:r>
-    </w:p>
-    <w:p>
-      <w:pPr>
-        <w:spacing w:after="80"/>
-        <w:jc w:val="left"/>
-      </w:pPr>
-      <w:r>
-        <w:rPr>
-          <w:rFonts w:ascii="Times New Roman" w:cs="Times New Roman" w:eastAsia="Times New Roman" w:hAnsi="Times New Roman"/>
-          <w:sz w:val="24"/>
-          <w:szCs w:val="24"/>
-        </w:rPr>
-        <w:t xml:space="preserve"/>
-      </w:r>
-    </w:p>
-    <w:p>
-      <w:pPr>
-        <w:spacing w:after="80"/>
-        <w:jc w:val="left"/>
-      </w:pPr>
-      <w:r>
-        <w:rPr>
-          <w:rFonts w:ascii="Times New Roman" w:cs="Times New Roman" w:eastAsia="Times New Roman" w:hAnsi="Times New Roman"/>
-          <w:b/>
-          <w:bCs/>
-          <w:sz w:val="24"/>
-          <w:szCs w:val="24"/>
-        </w:rPr>
-        <w:t xml:space="preserve">Руководитель:</w:t>
-      </w:r>
-      <w:r>
-        <w:rPr>
-          <w:rFonts w:ascii="Times New Roman" w:cs="Times New Roman" w:eastAsia="Times New Roman" w:hAnsi="Times New Roman"/>
-          <w:sz w:val="24"/>
-          <w:szCs w:val="24"/>
-        </w:rPr>
-        <w:t xml:space="preserve">                 (подпись и печать)        </w:t>
-      </w:r>
-      <w:r>
-        <w:rPr>
-          <w:rFonts w:ascii="Times New Roman" w:cs="Times New Roman" w:eastAsia="Times New Roman" w:hAnsi="Times New Roman"/>
-          <w:b/>
-          <w:bCs/>
-          <w:sz w:val="24"/>
-          <w:szCs w:val="24"/>
-        </w:rPr>
-        <w:t xml:space="preserve">{{plaintiff_fio}}</w:t>
-      </w:r>
-    </w:p>
-    <w:p>
-      <w:pPr>
-        <w:spacing w:after="80"/>
-        <w:jc w:val="left"/>
-      </w:pPr>
-      <w:r>
-        <w:rPr>
-          <w:rFonts w:ascii="Times New Roman" w:cs="Times New Roman" w:eastAsia="Times New Roman" w:hAnsi="Times New Roman"/>
-          <w:sz w:val="24"/>
-          <w:szCs w:val="24"/>
-        </w:rPr>
-        <w:t xml:space="preserve">{{/applicant_is_org}}</w:t>
       </w:r>
     </w:p>
     <w:sectPr>

</xml_diff>